<commit_message>
Add Pastor's Triangle diagram, org chart PDF, rebuilt Vision sessions PDF; remove duplicate combined committee guides
</commit_message>
<xml_diff>
--- a/files/SFUMC_Frameworks_PastorsTriangle_2024.docx
+++ b/files/SFUMC_Frameworks_PastorsTriangle_2024.docx
@@ -53,6 +53,58 @@
       </w:pPr>
       <w:r>
         <w:t xml:space="preserve">Most clergy burnout is not a failure of effort. It is the result of one corner of the work expanding until it crowds out the rest. The Pastor’s Triangle gives language for the whole role so a pastor, a staff-parish committee, or a search team can talk honestly about where the time is actually going and where it ought to go.</w:t>
+      </w:r>
+    </w:p>
+    <w:p>
+      <w:pPr>
+        <w:jc w:val="center"/>
+      </w:pPr>
+      <w:r>
+        <w:drawing>
+          <wp:inline xmlns:a="http://schemas.openxmlformats.org/drawingml/2006/main" xmlns:pic="http://schemas.openxmlformats.org/drawingml/2006/picture">
+            <wp:extent cx="5486400" cy="3987654"/>
+            <wp:docPr id="1" name="Picture 1"/>
+            <wp:cNvGraphicFramePr>
+              <a:graphicFrameLocks noChangeAspect="1"/>
+            </wp:cNvGraphicFramePr>
+            <a:graphic>
+              <a:graphicData uri="http://schemas.openxmlformats.org/drawingml/2006/picture">
+                <pic:pic>
+                  <pic:nvPicPr>
+                    <pic:cNvPr id="0" name="pastors-triangle-diagram.png"/>
+                    <pic:cNvPicPr/>
+                  </pic:nvPicPr>
+                  <pic:blipFill>
+                    <a:blip r:embed="rId9"/>
+                    <a:stretch>
+                      <a:fillRect/>
+                    </a:stretch>
+                  </pic:blipFill>
+                  <pic:spPr>
+                    <a:xfrm>
+                      <a:off x="0" y="0"/>
+                      <a:ext cx="5486400" cy="3987654"/>
+                    </a:xfrm>
+                    <a:prstGeom prst="rect"/>
+                  </pic:spPr>
+                </pic:pic>
+              </a:graphicData>
+            </a:graphic>
+          </wp:inline>
+        </w:drawing>
+      </w:r>
+    </w:p>
+    <w:p>
+      <w:pPr>
+        <w:jc w:val="center"/>
+      </w:pPr>
+      <w:r>
+        <w:rPr>
+          <w:i/>
+          <w:color w:val="6B6B6B"/>
+          <w:sz w:val="18"/>
+        </w:rPr>
+        <w:t>The Pastor’s Triangle, reproduced from Pastoral Ministry: Systems, Processes, and Resources (2024)</w:t>
       </w:r>
     </w:p>
     <w:p>

</xml_diff>

<commit_message>
Correct Pastor's Triangle doc: teaching line and blue dot sections replace Teacher-at-center reading
</commit_message>
<xml_diff>
--- a/files/SFUMC_Frameworks_PastorsTriangle_2024.docx
+++ b/files/SFUMC_Frameworks_PastorsTriangle_2024.docx
@@ -176,7 +176,7 @@
         <w:pStyle w:val="Heading1"/>
       </w:pPr>
       <w:r>
-        <w:t xml:space="preserve">Teacher at the center</w:t>
+        <w:t>The teaching line</w:t>
       </w:r>
     </w:p>
     <w:p>
@@ -184,7 +184,31 @@
         <w:spacing w:after="120" w:line="300"/>
       </w:pPr>
       <w:r>
-        <w:t xml:space="preserve">At the middle of the triangle, touching all three corners, is the Teacher. Christian formation is not a fourth competing demand so much as the thread that runs through the other three. The Teacher works as Lecturer, in classes and content, the kind of teaching that informs, and as Facilitator, in groups, small-group leadership, and confirmation, the kind of teaching that forms. The Shepherd teaches in counsel, the Preacher teaches from the pulpit, and the Executive teaches by equipping leaders. Keeping the Teacher at the center is what holds the three corners together rather than letting them pull apart.</w:t>
+        <w:t>A red line crosses the diagram from Lecturer on one side to Facilitator on the other. That line is the pastor's teaching role. Pastors teach constantly, in study settings and in meetings, and the line names the two modes that teaching takes. The Lecturer delivers content: the prepared Bible study, the doctrinal class, the report a committee needs explained. The Facilitator draws the room out: the discussion that finds its own way to the text, the meeting where the leader's job is to surface what others already know. The work of teaching is oscillation, sliding back and forth along that line as the setting demands. The line intersects the rest of the ministry because teaching happens in every corner, but it is not the center of the work. It is a mode the pastor moves through while doing everything else.</w:t>
+      </w:r>
+    </w:p>
+    <w:p>
+      <w:pPr>
+        <w:pStyle w:val="Heading1"/>
+      </w:pPr>
+      <w:r>
+        <w:t>The blue dot</w:t>
+      </w:r>
+    </w:p>
+    <w:p>
+      <w:pPr>
+        <w:spacing w:after="120" w:line="300"/>
+      </w:pPr>
+      <w:r>
+        <w:t>The blue dot in the middle is the hypothetical center of pastoral identity. In a perfect world a pastor lives at the center, equally proficient in every part of the triangle, floating to whichever corner or side a situation calls for. Paul described that kind of range when he wrote that he had become all things to all people so that by all possible means he might save some.</w:t>
+      </w:r>
+    </w:p>
+    <w:p>
+      <w:pPr>
+        <w:spacing w:after="120" w:line="300"/>
+      </w:pPr>
+      <w:r>
+        <w:t>The truth is that most pastors do not live at the center. Nearly everyone has a natural tendency to drift toward one side of the triangle and spend most of the week there. That is not a flaw as long as the pastor knows it. Self-awareness turns a natural tendency into a staffing plan: a pastor who lives near one corner needs people close by, on staff and among the laity, who can cover the spaces the pastor inhabits less. Being a good pastor means being able to reach every corner and side when the moment requires it. A pastor who lives in one area and never accesses the others will find that the deficiency limits the ministry, and left unattended it can cripple it.</w:t>
       </w:r>
     </w:p>
     <w:p>

</xml_diff>